<commit_message>
Add team members, Scrum Master, and Product Owner to Iteration 1 report
Co-authored-by: Copilot App <223556219+Copilot@users.noreply.github.com>
</commit_message>
<xml_diff>
--- a/.reports/scrum reports/scrum-report-2026-10-19.docx
+++ b/.reports/scrum reports/scrum-report-2026-10-19.docx
@@ -127,9 +127,8 @@
             <w:tcW w:type="dxa" w:w="4968"/>
           </w:tcPr>
           <w:p>
-            <w:r/>
             <w:r>
-              <w:t>To confirm with the team</w:t>
+              <w:t>Merrick Moss, Jonathan Merritt, Evan Hack, Gregory Kaczorowski</w:t>
             </w:r>
           </w:p>
         </w:tc>
@@ -174,9 +173,8 @@
             <w:tcW w:type="dxa" w:w="4968"/>
           </w:tcPr>
           <w:p>
-            <w:r/>
             <w:r>
-              <w:t>To confirm for this iteration</w:t>
+              <w:t>Jonathan Merritt</w:t>
             </w:r>
           </w:p>
         </w:tc>

</xml_diff>